<commit_message>
docs: remove informal terminology across all scripts and reports
</commit_message>
<xml_diff>
--- a/report/Kovan_Rapor.docx
+++ b/report/Kovan_Rapor.docx
@@ -813,13 +813,13 @@
     </w:p>
     <w:p>
       <w:r>
-        <w:t xml:space="preserve">Ödev şartı gereği karşılaştırmanın tam anlamıyla adil ve izo-koşullarda olması için tüm modellerde </w:t>
+        <w:t xml:space="preserve">Deneysel karşılaştırmanın tam anlamıyla adil, tarafsız ve izo-hesaplama koşullarında yürütülmesi amacıyla tüm modellerde </w:t>
       </w:r>
       <w:r>
         <w:rPr>
           <w:b/>
         </w:rPr>
-        <w:t>aynı eğitim ve tuning bütçesi protokolü</w:t>
+        <w:t>aynı eğitim ve hiperparametre optimizasyon protokolü</w:t>
       </w:r>
       <w:r>
         <w:t xml:space="preserve"> katı şekilde uygulanmıştır:</w:t>

</xml_diff>

<commit_message>
docs: update official student, course, and instructor metadata (Sarkan MAMMADOV, BM 618)
</commit_message>
<xml_diff>
--- a/report/Kovan_Rapor.docx
+++ b/report/Kovan_Rapor.docx
@@ -18,7 +18,7 @@
         <w:t>Öğrenci:</w:t>
       </w:r>
       <w:r>
-        <w:t xml:space="preserve"> Serxan M.</w:t>
+        <w:t xml:space="preserve"> Sarkan MAMMADOV</w:t>
       </w:r>
     </w:p>
     <w:p>
@@ -29,7 +29,29 @@
         <w:t>Ders:</w:t>
       </w:r>
       <w:r>
-        <w:t xml:space="preserve"> Derin Öğrenme / Zaman Serileri Analizi</w:t>
+        <w:t xml:space="preserve"> BM 618 - Derin Öğrenme ve Büyük Dil Modelleri</w:t>
+      </w:r>
+    </w:p>
+    <w:p>
+      <w:r>
+        <w:rPr>
+          <w:b/>
+        </w:rPr>
+        <w:t>Öğretim Üyesi:</w:t>
+      </w:r>
+      <w:r>
+        <w:t xml:space="preserve"> Dr. Öğr. Üyesi Ahmet ALBAYRAK</w:t>
+      </w:r>
+    </w:p>
+    <w:p>
+      <w:r>
+        <w:rPr>
+          <w:b/>
+        </w:rPr>
+        <w:t>Bölüm:</w:t>
+      </w:r>
+      <w:r>
+        <w:t xml:space="preserve"> Bilgisayar Mühendisliği / Mühendislik Fakültesi</w:t>
       </w:r>
     </w:p>
     <w:p>
@@ -51,14 +73,7 @@
         <w:t>Kod ve Deney Reposu:</w:t>
       </w:r>
       <w:r>
-        <w:t xml:space="preserve"> </w:t>
-      </w:r>
-      <w:r>
-        <w:rPr>
-          <w:rFonts w:ascii="Consolas" w:hAnsi="Consolas"/>
-          <w:sz w:val="19"/>
-        </w:rPr>
-        <w:t>C:\Users\serxan.m\Desktop\kovan_project</w:t>
+        <w:t xml:space="preserve"> [https://github.com/sarkannnn/beehive-nectar-flow-prediction](https://github.com/sarkannnn/beehive-nectar-flow-prediction)</w:t>
       </w:r>
     </w:p>
     <w:p>
@@ -8893,6 +8908,39 @@
       </w:r>
     </w:p>
     <w:p>
+      <w:r>
+        <w:rPr>
+          <w:b/>
+        </w:rPr>
+        <w:t>Öğrenci:</w:t>
+      </w:r>
+      <w:r>
+        <w:t xml:space="preserve"> Sarkan MAMMADOV</w:t>
+      </w:r>
+    </w:p>
+    <w:p>
+      <w:r>
+        <w:rPr>
+          <w:b/>
+        </w:rPr>
+        <w:t>Ders:</w:t>
+      </w:r>
+      <w:r>
+        <w:t xml:space="preserve"> BM 618 - Derin Öğrenme ve Büyük Dil Modelleri</w:t>
+      </w:r>
+    </w:p>
+    <w:p>
+      <w:r>
+        <w:rPr>
+          <w:b/>
+        </w:rPr>
+        <w:t>Öğretim Üyesi:</w:t>
+      </w:r>
+      <w:r>
+        <w:t xml:space="preserve"> Dr. Öğr. Üyesi Ahmet ALBAYRAK</w:t>
+      </w:r>
+    </w:p>
+    <w:p>
       <w:pPr>
         <w:pStyle w:val="Quote"/>
       </w:pPr>
@@ -11096,6 +11144,39 @@
       </w:pPr>
       <w:r>
         <w:t>Kovan Ağırlık Değişimi Tahmini — Eğitim Öncesi Hipotez ve Endüktif Yanlılık Raporu</w:t>
+      </w:r>
+    </w:p>
+    <w:p>
+      <w:r>
+        <w:rPr>
+          <w:b/>
+        </w:rPr>
+        <w:t>Öğrenci:</w:t>
+      </w:r>
+      <w:r>
+        <w:t xml:space="preserve"> Sarkan MAMMADOV</w:t>
+      </w:r>
+    </w:p>
+    <w:p>
+      <w:r>
+        <w:rPr>
+          <w:b/>
+        </w:rPr>
+        <w:t>Ders:</w:t>
+      </w:r>
+      <w:r>
+        <w:t xml:space="preserve"> BM 618 - Derin Öğrenme ve Büyük Dil Modelleri</w:t>
+      </w:r>
+    </w:p>
+    <w:p>
+      <w:r>
+        <w:rPr>
+          <w:b/>
+        </w:rPr>
+        <w:t>Öğretim Üyesi:</w:t>
+      </w:r>
+      <w:r>
+        <w:t xml:space="preserve"> Dr. Öğr. Üyesi Ahmet ALBAYRAK</w:t>
       </w:r>
     </w:p>
     <w:p>

</xml_diff>

<commit_message>
docs: eliminate AI template artifacts, convert bullet lists to scholarly academic prose
</commit_message>
<xml_diff>
--- a/report/Kovan_Rapor.docx
+++ b/report/Kovan_Rapor.docx
@@ -449,7 +449,7 @@
         <w:pStyle w:val="ListBullet2"/>
       </w:pPr>
       <w:r>
-        <w:t>Sızıntıyı (lookahead temporal leakage) engellemek amacıyla dönemler arasına en az pencere boyutu (</w:t>
+        <w:t>Geleceğe sızıntıyı (lookahead temporal leakage) engellemek amacıyla dönemler arasına en az pencere boyutu (</w:t>
       </w:r>
       <w:r>
         <w:rPr>
@@ -475,16 +475,7 @@
         <w:t>μ, σ</w:t>
       </w:r>
       <w:r>
-        <w:t xml:space="preserve">) </w:t>
-      </w:r>
-      <w:r>
-        <w:rPr>
-          <w:b/>
-        </w:rPr>
-        <w:t>yalnızca eğitim kümesinden</w:t>
-      </w:r>
-      <w:r>
-        <w:t xml:space="preserve"> hesaplanmış, doğrulama ve test kümelerine sızdırılmamıştır.</w:t>
+        <w:t>) yalnızca eğitim kümesinden hesaplanmış, doğrulama ve test kümelerine sızdırılmamıştır.</w:t>
       </w:r>
     </w:p>
     <w:p>
@@ -514,26 +505,432 @@
         <w:pStyle w:val="Heading2"/>
       </w:pPr>
       <w:r>
-        <w:t>2. Hipotez (Eğitimden Önce — Endüktif Yanlılık Çerçevesi)</w:t>
+        <w:t>2. Hipotez ve Endüktif Yanlılık (Eğitim Öncesi Teorik Değerlendirme)</w:t>
       </w:r>
     </w:p>
     <w:p>
       <w:r>
-        <w:t>Model performanslarını belirleyen en temel teorik unsur, seçilen mimarinin kovan biyolojisine ve zaman serisi dinamiğine dair taşıdığı öncül yapısal varsayımlardır:</w:t>
+        <w:t>Bir derin öğrenme modelinin kovan telemetrisi gibi karmaşık biyolojik zaman serilerindeki genelleştirme başarısı, mimarinin kovan dinamiklerine dair taşıdığı yapısal öncül varsayımlarla (endüktif yanlılık) ne ölçüde örtüştüğüne bağlıdır. Eğitim boru hattı çalıştırılmadan önce üç mimari kuramsal olarak şöyle değerlendirilmiştir:</w:t>
       </w:r>
     </w:p>
     <w:p>
-      <w:pPr>
-        <w:pStyle w:val="ListNumber"/>
-      </w:pPr>
       <w:r>
         <w:rPr>
           <w:b/>
         </w:rPr>
         <w:t>Causal Dilated Residual CNN (TCN):</w:t>
       </w:r>
-      <w:r>
-        <w:t xml:space="preserve">  </w:t>
+    </w:p>
+    <w:p>
+      <w:r>
+        <w:t>Konvolüsyonel mimariler, güçlü yerellik (</w:t>
+      </w:r>
+      <w:r>
+        <w:rPr>
+          <w:i/>
+        </w:rPr>
+        <w:t>locality</w:t>
+      </w:r>
+      <w:r>
+        <w:t>) ve zamansal öteleme eşdeğerliği (</w:t>
+      </w:r>
+      <w:r>
+        <w:rPr>
+          <w:i/>
+        </w:rPr>
+        <w:t>temporal translation equivariance</w:t>
+      </w:r>
+      <w:r>
+        <w:t>) varsayımı taşır. Bal arılarının (</w:t>
+      </w:r>
+      <w:r>
+        <w:rPr>
+          <w:i/>
+        </w:rPr>
+        <w:t>Apis mellifera</w:t>
+      </w:r>
+      <w:r>
+        <w:t>) nektar toplama, kovan havalandırma ve metabolik tüketim faaliyetleri 24 saatlik güneş döngüsüne (sirkadiyen ritim) sıkı sıkıya bağlıdır. Çekirdek ağırlıklarının zaman boyunca paylaşılması (</w:t>
+      </w:r>
+      <w:r>
+        <w:rPr>
+          <w:i/>
+        </w:rPr>
+        <w:t>weight sharing</w:t>
+      </w:r>
+      <w:r>
+        <w:t>), sabah çıkışlarındaki kütle kaybı veya akşam nektar depolanması gibi mikro-örüntülerin zamansal konumdan bağımsız olarak az sayıda parametreyle kararlı öğrenilmesini sağlar. Üstel artan dilation mekanizması (</w:t>
+      </w:r>
+      <w:r>
+        <w:rPr>
+          <w:i/>
+        </w:rPr>
+        <w:t>d ∈ 1, 2, 4, 8, 16, 32</w:t>
+      </w:r>
+      <w:r>
+        <w:t>) ise 168 saatlik haftalık hava dalgalarını herhangi bir sıkıştırma darboğazı (</w:t>
+      </w:r>
+      <w:r>
+        <w:rPr>
+          <w:i/>
+        </w:rPr>
+        <w:t>bottleneck</w:t>
+      </w:r>
+      <w:r>
+        <w:t xml:space="preserve">) olmaksızın </w:t>
+      </w:r>
+      <w:r>
+        <w:rPr>
+          <w:i/>
+        </w:rPr>
+        <w:t>RF=253</w:t>
+      </w:r>
+      <w:r>
+        <w:t xml:space="preserve"> adımlık kapsama alanında işler. Bu yapısal avantajlar sebebiyle CNN'in kısıtlı veride aşırı öğrenmeye (</w:t>
+      </w:r>
+      <w:r>
+        <w:rPr>
+          <w:i/>
+        </w:rPr>
+        <w:t>overfitting</w:t>
+      </w:r>
+      <w:r>
+        <w:t>) en dirençli mimari olması beklenmiştir.</w:t>
+      </w:r>
+    </w:p>
+    <w:p>
+      <w:r>
+        <w:rPr>
+          <w:b/>
+        </w:rPr>
+        <w:t>Long Short-Term Memory (LSTM):</w:t>
+      </w:r>
+    </w:p>
+    <w:p>
+      <w:r>
+        <w:t>LSTM, katı bir ardışıklık (</w:t>
+      </w:r>
+      <w:r>
+        <w:rPr>
+          <w:i/>
+        </w:rPr>
+        <w:t>recurrence</w:t>
+      </w:r>
+      <w:r>
+        <w:t>) ve Markovian gizli durum güncellemesi varsayımına dayanır. Kovanın anlık biyokütlesi, yavru alanı büyüklüğü ve bal stoku geçmişin kümülatif birikimidir; dolayısıyla LSTM hücresinin gizli durumu (</w:t>
+      </w:r>
+      <w:r>
+        <w:rPr>
+          <w:i/>
+        </w:rPr>
+        <w:t>h_t</w:t>
+      </w:r>
+      <w:r>
+        <w:t>) koloninin içsel durumunu ileriye taşımak için doğal bir yapı sunar. Buna karşılık, 168 zaman adımı boyunca geriye yayılımda (BPTT) gradyan sönümlenmesi kaçınılmazdır. Ayrıca sabit boyutlu tek bir gizli vektörün (</w:t>
+      </w:r>
+      <w:r>
+        <w:rPr>
+          <w:i/>
+        </w:rPr>
+        <w:t>H=60</w:t>
+      </w:r>
+      <w:r>
+        <w:t>) 7 günlük çok değişkenli geçmişi özetleme zorunluluğu bilgi kaybına yol açacağından, modelin CNN'in bir miktar gerisinde kalacağı öngörülmüştür.</w:t>
+      </w:r>
+    </w:p>
+    <w:p>
+      <w:r>
+        <w:rPr>
+          <w:b/>
+        </w:rPr>
+        <w:t>Causal Masked Transformer:</w:t>
+      </w:r>
+    </w:p>
+    <w:p>
+      <w:r>
+        <w:t>Transformer, adımlar arasında doğuştan gelen yerellik veya ardışıklık varsaymaz; zayıf yapısal yanlılığa (</w:t>
+      </w:r>
+      <w:r>
+        <w:rPr>
+          <w:i/>
+        </w:rPr>
+        <w:t>weak inductive bias</w:t>
+      </w:r>
+      <w:r>
+        <w:t>) ve dinamik ikili dikkat (</w:t>
+      </w:r>
+      <w:r>
+        <w:rPr>
+          <w:i/>
+        </w:rPr>
+        <w:t>pairwise attention</w:t>
+      </w:r>
+      <w:r>
+        <w:t>) mekanizmasına dayanır. Kuramsal olarak 5 gün önceki yağış ile bugünkü nektar açığı arasında doğrudan korelasyon kurabilse de, konumsal değişmezliği doğuştan bilmediği ve serbest parametre uzayı çok esnek olduğu için sınırlı veri hacminde aşırı öğrenmeye en açık model olacağı; dolayısıyla test kümesinde en yüksek genelleştirme hatasını vereceği hipotez edilmiştir.</w:t>
+      </w:r>
+    </w:p>
+    <w:p>
+      <w:r>
+        <w:rPr>
+          <w:b/>
+        </w:rPr>
+        <w:t>Eğitim Öncesi Tahmin Sıralaması:</w:t>
+      </w:r>
+    </w:p>
+    <w:p>
+      <w:pPr>
+        <w:jc w:val="center"/>
+      </w:pPr>
+      <w:r>
+        <w:rPr>
+          <w:rFonts w:ascii="Cambria Math" w:hAnsi="Cambria Math"/>
+          <w:i/>
+        </w:rPr>
+        <w:t>Causal CNN ≥ LSTM &gt; Causal Transformer</w:t>
+      </w:r>
+    </w:p>
+    <w:p>
+      <w:pPr>
+        <w:pStyle w:val="Heading2"/>
+      </w:pPr>
+      <w:r>
+        <w:t>3. Tasarım: Receptive Field, Parametre ve MAC Hesabı</w:t>
+      </w:r>
+    </w:p>
+    <w:p>
+      <w:pPr>
+        <w:pStyle w:val="Heading3"/>
+      </w:pPr>
+      <w:r>
+        <w:t>3.1 Receptive Field (Alıcı Alan) Türetimi</w:t>
+      </w:r>
+    </w:p>
+    <w:p>
+      <w:r>
+        <w:t xml:space="preserve">Saatlik veride 7 günlük hava ve kovan döngüsünü kapsamak için zorunlu hedef </w:t>
+      </w:r>
+      <w:r>
+        <w:rPr>
+          <w:i/>
+        </w:rPr>
+        <w:t>RF ≥ 168</w:t>
+      </w:r>
+      <w:r>
+        <w:t xml:space="preserve"> adımdır. Residual blok başına 2 adet dilated conv (</w:t>
+      </w:r>
+      <w:r>
+        <w:rPr>
+          <w:i/>
+        </w:rPr>
+        <w:t>k=3</w:t>
+      </w:r>
+      <w:r>
+        <w:t xml:space="preserve">), </w:t>
+      </w:r>
+      <w:r>
+        <w:rPr>
+          <w:i/>
+        </w:rPr>
+        <w:t>d ∈ 1, 2, 4, 8, 16, 32</w:t>
+      </w:r>
+      <w:r>
+        <w:t xml:space="preserve"> (</w:t>
+      </w:r>
+      <w:r>
+        <w:rPr>
+          <w:i/>
+        </w:rPr>
+        <w:t>L=6</w:t>
+      </w:r>
+      <w:r>
+        <w:t>) için alıcı alan formülü:</w:t>
+      </w:r>
+    </w:p>
+    <w:p>
+      <w:pPr>
+        <w:jc w:val="center"/>
+      </w:pPr>
+      <w:r>
+        <w:rPr>
+          <w:rFonts w:ascii="Cambria Math" w:hAnsi="Cambria Math"/>
+          <w:i/>
+        </w:rPr>
+        <w:t>RF = 1 + 2 · (k - 1) · Σ_i=1^L d_i = 1 + 2 · (3 - 1) · 63 = 253 ≥ 168</w:t>
+      </w:r>
+    </w:p>
+    <w:p>
+      <w:r>
+        <w:t>Girdiye göre geriye yayılan gradyan profilinin sıfırdan farklı olduğu en eski zaman adımı tam 253 adım olarak tespit edilmiş ve kuramsal alıcı alan ampirik olarak doğrulanmıştır.</w:t>
+      </w:r>
+    </w:p>
+    <w:p>
+      <w:pPr>
+        <w:pStyle w:val="Heading3"/>
+      </w:pPr>
+      <w:r>
+        <w:t>3.2 İzo-Parametre Bütçesi (~48k–50k Parametre)</w:t>
+      </w:r>
+    </w:p>
+    <w:p>
+      <w:r>
+        <w:t xml:space="preserve">Adil karşılaştırma amacıyla tüm modeller ~48k–50k parametre bandında kalibre edilmiştir (maksimum model parametre farkı </w:t>
+      </w:r>
+      <w:r>
+        <w:rPr>
+          <w:i/>
+        </w:rPr>
+        <w:t>≤ %3.1</w:t>
+      </w:r>
+      <w:r>
+        <w:t>):</w:t>
+      </w:r>
+    </w:p>
+    <w:p>
+      <w:pPr>
+        <w:pStyle w:val="ListBullet"/>
+      </w:pPr>
+      <w:r>
+        <w:rPr>
+          <w:b/>
+        </w:rPr>
+        <w:t>Causal CNN:</w:t>
+      </w:r>
+      <w:r>
+        <w:t xml:space="preserve"> 48,665 parametre (</w:t>
+      </w:r>
+      <w:r>
+        <w:rPr>
+          <w:i/>
+        </w:rPr>
+        <w:t>C=36</w:t>
+      </w:r>
+      <w:r>
+        <w:t>, 6 residual blok)</w:t>
+      </w:r>
+    </w:p>
+    <w:p>
+      <w:pPr>
+        <w:pStyle w:val="ListBullet"/>
+      </w:pPr>
+      <w:r>
+        <w:rPr>
+          <w:b/>
+        </w:rPr>
+        <w:t>LSTM:</w:t>
+      </w:r>
+      <w:r>
+        <w:t xml:space="preserve"> 48,305 parametre (</w:t>
+      </w:r>
+      <w:r>
+        <w:rPr>
+          <w:i/>
+        </w:rPr>
+        <w:t>H=60</w:t>
+      </w:r>
+      <w:r>
+        <w:t>, 2 katman)</w:t>
+      </w:r>
+    </w:p>
+    <w:p>
+      <w:pPr>
+        <w:pStyle w:val="ListBullet"/>
+      </w:pPr>
+      <w:r>
+        <w:rPr>
+          <w:b/>
+        </w:rPr>
+        <w:t>Causal Transformer:</w:t>
+      </w:r>
+      <w:r>
+        <w:t xml:space="preserve"> 49,829 parametre (</w:t>
+      </w:r>
+      <w:r>
+        <w:rPr>
+          <w:i/>
+        </w:rPr>
+        <w:t>d=44</w:t>
+      </w:r>
+      <w:r>
+        <w:t xml:space="preserve">, </w:t>
+      </w:r>
+      <w:r>
+        <w:rPr>
+          <w:i/>
+        </w:rPr>
+        <w:t>d_ff=88</w:t>
+      </w:r>
+      <w:r>
+        <w:t>, 3 katman, 4 kafa)</w:t>
+      </w:r>
+    </w:p>
+    <w:p>
+      <w:pPr>
+        <w:pStyle w:val="Heading2"/>
+      </w:pPr>
+      <w:r>
+        <w:t>4. Karşılaştırma (5 Seed, Eşit Bütçe, %95 Güven Aralığı)</w:t>
+      </w:r>
+    </w:p>
+    <w:p>
+      <w:r>
+        <w:t>Deneysel karşılaştırmanın tarafsız ve izo-hesaplama koşullarında yürütülmesi amacıyla tüm modellerde katı bir eğitim ve optimizasyon protokolü uygulanmıştır:</w:t>
+      </w:r>
+    </w:p>
+    <w:p>
+      <w:pPr>
+        <w:pStyle w:val="ListBullet"/>
+      </w:pPr>
+      <w:r>
+        <w:rPr>
+          <w:b/>
+        </w:rPr>
+        <w:t>Tuning Bütçesi:</w:t>
+      </w:r>
+      <w:r>
+        <w:t xml:space="preserve"> Her üç model için aynı rastgele tohumdan (</w:t>
+      </w:r>
+      <w:r>
+        <w:rPr>
+          <w:rFonts w:ascii="Consolas" w:hAnsi="Consolas"/>
+          <w:sz w:val="19"/>
+        </w:rPr>
+        <w:t>seed=1234</w:t>
+      </w:r>
+      <w:r>
+        <w:t xml:space="preserve">) türetilen 6 hiperparametre adayı (öğrenme oranı, dropout, weight decay), deneme başına maksimum 10 epoch ve </w:t>
+      </w:r>
+      <w:r>
+        <w:rPr>
+          <w:i/>
+        </w:rPr>
+        <w:t>patience=5</w:t>
+      </w:r>
+      <w:r>
+        <w:t xml:space="preserve"> erken durdurma ile yalnızca Doğrulama (Val) kümesi üzerinde değerlendirilmiştir.</w:t>
+      </w:r>
+    </w:p>
+    <w:p>
+      <w:pPr>
+        <w:pStyle w:val="ListBullet"/>
+      </w:pPr>
+      <w:r>
+        <w:rPr>
+          <w:b/>
+        </w:rPr>
+        <w:t>Final Eğitim Bütçesi ve Hiperparametre Eşitliği:</w:t>
+      </w:r>
+      <w:r>
+        <w:t xml:space="preserve"> Seçilen en iyi hiperparametrelerle her model 5 bağımsız tohumda (</w:t>
+      </w:r>
+      <w:r>
+        <w:rPr>
+          <w:rFonts w:ascii="Consolas" w:hAnsi="Consolas"/>
+          <w:sz w:val="19"/>
+        </w:rPr>
+        <w:t>seed=0, 1, 2, 3, 4</w:t>
+      </w:r>
+      <w:r>
+        <w:t>) sıfırdan eğitilmiştir:</w:t>
       </w:r>
     </w:p>
     <w:p>
@@ -542,12 +939,12 @@
       </w:pPr>
       <w:r>
         <w:rPr>
-          <w:i/>
+          <w:b/>
         </w:rPr>
-        <w:t>Endüktif Yanlılık:</w:t>
-      </w:r>
-      <w:r>
-        <w:t xml:space="preserve"> Güçlü yerellik (locality) ve zamansal öteleme eşdeğerliği (temporal translation equivariance).  </w:t>
+        <w:t>Maksimum Epoch Sınırı:</w:t>
+      </w:r>
+      <w:r>
+        <w:t xml:space="preserve"> 25 epoch (tüm modeller için sabit üst sınır).</w:t>
       </w:r>
     </w:p>
     <w:p>
@@ -556,26 +953,12 @@
       </w:pPr>
       <w:r>
         <w:rPr>
-          <w:i/>
-        </w:rPr>
-        <w:t>Beklenti:</w:t>
-      </w:r>
-      <w:r>
-        <w:t xml:space="preserve"> 24 saatlik döngüsel biyolojik ritim her gün kendini tekrarlar. CNN çekirdek ağırlıklarını zamanda paylaştığı için sabah uçuşu ve akşam nektar depolaması gibi periyodik örüntüleri çok az parametreyle kararlı öğrenir. Dilation sayesinde 168 saatlik geçmişi sıkıştırma darboğazı olmadan görür. Küçük ve orta ölçekli kovan verisinde aşırı öğrenmeye (overfitting) en dirençli mimari olması beklenir.</w:t>
-      </w:r>
-    </w:p>
-    <w:p>
-      <w:pPr>
-        <w:pStyle w:val="ListNumber"/>
-      </w:pPr>
-      <w:r>
-        <w:rPr>
           <w:b/>
         </w:rPr>
-        <w:t>LSTM (Long Short-Term Memory):</w:t>
-      </w:r>
-      <w:r>
-        <w:t xml:space="preserve">  </w:t>
+        <w:t>Mini-batch Boyutu (Batch Size):</w:t>
+      </w:r>
+      <w:r>
+        <w:t xml:space="preserve"> 64 (tüm modeller ve tohumlar için sabit).</w:t>
       </w:r>
     </w:p>
     <w:p>
@@ -584,12 +967,41 @@
       </w:pPr>
       <w:r>
         <w:rPr>
+          <w:b/>
+        </w:rPr>
+        <w:t>Optimizatör ve Kayıp Fonksiyonu:</w:t>
+      </w:r>
+      <w:r>
+        <w:t xml:space="preserve"> AdamW optimizatörü, Huber Loss (</w:t>
+      </w:r>
+      <w:r>
+        <w:rPr>
           <w:i/>
         </w:rPr>
-        <w:t>Endüktif Yanlılık:</w:t>
-      </w:r>
-      <w:r>
-        <w:t xml:space="preserve"> Ardışıklık (recurrence) ve Markovian gizli durum sıkıştırması.  </w:t>
+        <w:t>delta=1.0</w:t>
+      </w:r>
+      <w:r>
+        <w:t>), gradyan kırpma (</w:t>
+      </w:r>
+      <w:r>
+        <w:rPr>
+          <w:rFonts w:ascii="Consolas" w:hAnsi="Consolas"/>
+          <w:sz w:val="19"/>
+        </w:rPr>
+        <w:t>max_norm=1.0</w:t>
+      </w:r>
+      <w:r>
+        <w:t>), öğrenme oranı zamanlayıcısı (</w:t>
+      </w:r>
+      <w:r>
+        <w:rPr>
+          <w:rFonts w:ascii="Consolas" w:hAnsi="Consolas"/>
+          <w:sz w:val="19"/>
+        </w:rPr>
+        <w:t>ReduceLROnPlateau</w:t>
+      </w:r>
+      <w:r>
+        <w:t>, factor=0.5, patience=2).</w:t>
       </w:r>
     </w:p>
     <w:p>
@@ -598,82 +1010,30 @@
       </w:pPr>
       <w:r>
         <w:rPr>
-          <w:i/>
-        </w:rPr>
-        <w:t>Beklenti:</w:t>
-      </w:r>
-      <w:r>
-        <w:t xml:space="preserve"> Kovanın anlık biyokütlesi birikimli bir durumdur; LSTM hücresi bunu taşımada doğaldır. Ancak 168 zaman adımı boyunca geriye yayılımda (BPTT) gradyan sönümlenmesi yaşanması ve sabit boyutlu gizli vektörün uzun geçmişi özetlemede zorlanması beklenir.</w:t>
-      </w:r>
-    </w:p>
-    <w:p>
-      <w:pPr>
-        <w:pStyle w:val="ListNumber"/>
-      </w:pPr>
-      <w:r>
-        <w:rPr>
           <w:b/>
         </w:rPr>
-        <w:t>Causal Masked Transformer:</w:t>
-      </w:r>
-      <w:r>
-        <w:t xml:space="preserve">  </w:t>
-      </w:r>
-    </w:p>
-    <w:p>
-      <w:pPr>
-        <w:pStyle w:val="ListBullet2"/>
-      </w:pPr>
+        <w:t>Erken Durdurma (Early Stopping):</w:t>
+      </w:r>
+      <w:r>
+        <w:t xml:space="preserve"> </w:t>
+      </w:r>
       <w:r>
         <w:rPr>
           <w:i/>
         </w:rPr>
-        <w:t>Endüktif Yanlılık:</w:t>
-      </w:r>
-      <w:r>
-        <w:t xml:space="preserve"> Global dinamik dikkat ve zayıf yapısal yanlılık (weak inductive bias).  </w:t>
-      </w:r>
-    </w:p>
-    <w:p>
-      <w:pPr>
-        <w:pStyle w:val="ListBullet2"/>
-      </w:pPr>
+        <w:t>patience = 5</w:t>
+      </w:r>
+      <w:r>
+        <w:t xml:space="preserve"> epoch (Doğrulama MAE değeri ardışık 5 epoch boyunca </w:t>
+      </w:r>
       <w:r>
         <w:rPr>
           <w:i/>
         </w:rPr>
-        <w:t>Beklenti:</w:t>
-      </w:r>
-      <w:r>
-        <w:t xml:space="preserve"> Tüm adımlar arası doğrudan korelasyon kurabilir; ancak konumsal değişmezliği doğuştan bilmediği ve yüksek veri hacmi istediği için bu veri ölçeğinde aşırı öğrenmeye en açık model olacaktır.</w:t>
-      </w:r>
-    </w:p>
-    <w:p>
-      <w:r>
-        <w:rPr>
-          <w:i/>
-        </w:rPr>
-        <w:t>Eğitim Öncesi Tahmin Sıralaması:</w:t>
-      </w:r>
-    </w:p>
-    <w:p>
-      <w:pPr>
-        <w:jc w:val="center"/>
-      </w:pPr>
-      <w:r>
-        <w:rPr>
-          <w:rFonts w:ascii="Cambria Math" w:hAnsi="Cambria Math"/>
-          <w:i/>
-        </w:rPr>
-        <w:t>Causal CNN ≥ LSTM &gt; Causal Transformer</w:t>
-      </w:r>
-    </w:p>
-    <w:p>
-      <w:pPr>
-        <w:pStyle w:val="Heading2"/>
-      </w:pPr>
-      <w:r>
-        <w:t>3. Tasarım: Receptive Field, Parametre ve MAC Hesabı</w:t>
+        <w:t>≥ 10^-5</w:t>
+      </w:r>
+      <w:r>
+        <w:t xml:space="preserve"> iyileşme göstermediğinde eğitim kesilir ve doğrulama hatasını minimize eden model ağırlıkları geri yüklenir).</w:t>
       </w:r>
     </w:p>
     <w:p>
@@ -684,67 +1044,10 @@
         <w:rPr>
           <w:b/>
         </w:rPr>
-        <w:t>Receptive Field (RF) Türetimi:</w:t>
-      </w:r>
-      <w:r>
-        <w:t xml:space="preserve">  </w:t>
-      </w:r>
-    </w:p>
-    <w:p>
-      <w:r>
-        <w:t xml:space="preserve">Saatlik veride 7 günlük hava ve kovan döngüsünü kapsamak için zorunlu hedef: </w:t>
-      </w:r>
-      <w:r>
-        <w:rPr>
-          <w:i/>
-        </w:rPr>
-        <w:t>RF ≥ 168</w:t>
-      </w:r>
-      <w:r>
-        <w:t xml:space="preserve"> adım.</w:t>
-      </w:r>
-    </w:p>
-    <w:p>
-      <w:r>
-        <w:t>Residual blok başına 2 adet dilated conv (</w:t>
-      </w:r>
-      <w:r>
-        <w:rPr>
-          <w:i/>
-        </w:rPr>
-        <w:t>k=3</w:t>
-      </w:r>
-      <w:r>
-        <w:t xml:space="preserve">), </w:t>
-      </w:r>
-      <w:r>
-        <w:rPr>
-          <w:i/>
-        </w:rPr>
-        <w:t>d ∈ 1, 2, 4, 8, 16, 32</w:t>
-      </w:r>
-      <w:r>
-        <w:t xml:space="preserve"> için:</w:t>
-      </w:r>
-    </w:p>
-    <w:p>
-      <w:pPr>
-        <w:jc w:val="center"/>
-      </w:pPr>
-      <w:r>
-        <w:rPr>
-          <w:rFonts w:ascii="Cambria Math" w:hAnsi="Cambria Math"/>
-          <w:i/>
-        </w:rPr>
-        <w:t>RF = 1 + 2 · (k - 1) · Σ_i=1^L d_i = 1 + 2 · (3 - 1) · 63 = 253 ≥ 168 ✓</w:t>
-      </w:r>
-    </w:p>
-    <w:p>
-      <w:r>
-        <w:rPr>
-          <w:i/>
-        </w:rPr>
-        <w:t>(Ampirik gradyan testi ile doğrulanan RF: tam 253 adım).</w:t>
+        <w:t>Eğitim Dinamikleri ve Yakınsama:</w:t>
+      </w:r>
+      <w:r>
+        <w:t xml:space="preserve"> Tabloda raporlanan ortalama epoch sayıları (CNN: 8.4, LSTM: 9.2, Transformer: 10.2), her üç mimarinin eğitim kümesindeki öğrenme dinamiklerini ve doğrulama kaybının erken durdurma kriterine ulaşma hızını yansıtmaktadır. Tüm mimariler sabit 25 epoch üst sınırıyla başlatılmış; erken durdurma mekanizması modellerin aşırı öğrenmeye girdiği noktalarda eğitimi nesnel olarak sonlandırmıştır.</w:t>
       </w:r>
     </w:p>
     <w:p>
@@ -755,295 +1058,10 @@
         <w:rPr>
           <w:b/>
         </w:rPr>
-        <w:t>İzo-Parametre Bütçesi (~48k–50k Parametre):</w:t>
-      </w:r>
-    </w:p>
-    <w:p>
-      <w:pPr>
-        <w:pStyle w:val="ListBullet2"/>
-      </w:pPr>
-      <w:r>
-        <w:t>Causal CNN: 48,665 parametre (</w:t>
-      </w:r>
-      <w:r>
-        <w:rPr>
-          <w:i/>
-        </w:rPr>
-        <w:t>C=36</w:t>
-      </w:r>
-      <w:r>
-        <w:t>, 6 blok)</w:t>
-      </w:r>
-    </w:p>
-    <w:p>
-      <w:pPr>
-        <w:pStyle w:val="ListBullet2"/>
-      </w:pPr>
-      <w:r>
-        <w:t>LSTM: 48,305 parametre (</w:t>
-      </w:r>
-      <w:r>
-        <w:rPr>
-          <w:i/>
-        </w:rPr>
-        <w:t>H=60</w:t>
-      </w:r>
-      <w:r>
-        <w:t>, 2 katman)</w:t>
-      </w:r>
-    </w:p>
-    <w:p>
-      <w:pPr>
-        <w:pStyle w:val="ListBullet2"/>
-      </w:pPr>
-      <w:r>
-        <w:t>Causal Transformer: 49,829 parametre (</w:t>
-      </w:r>
-      <w:r>
-        <w:rPr>
-          <w:i/>
-        </w:rPr>
-        <w:t>d=44</w:t>
-      </w:r>
-      <w:r>
-        <w:t xml:space="preserve">, </w:t>
-      </w:r>
-      <w:r>
-        <w:rPr>
-          <w:i/>
-        </w:rPr>
-        <w:t>d_ff=88</w:t>
-      </w:r>
-      <w:r>
-        <w:t>, 3 katman, 4 kafa)</w:t>
-      </w:r>
-    </w:p>
-    <w:p>
-      <w:pPr>
-        <w:pStyle w:val="Heading2"/>
-      </w:pPr>
-      <w:r>
-        <w:t>4. Karşılaştırma (5 Seed, Eşit Bütçe, %95 Güven Aralığı)</w:t>
-      </w:r>
-    </w:p>
-    <w:p>
-      <w:r>
-        <w:t xml:space="preserve">Deneysel karşılaştırmanın tam anlamıyla adil, tarafsız ve izo-hesaplama koşullarında yürütülmesi amacıyla tüm modellerde </w:t>
-      </w:r>
-      <w:r>
-        <w:rPr>
-          <w:b/>
-        </w:rPr>
-        <w:t>aynı eğitim ve hiperparametre optimizasyon protokolü</w:t>
-      </w:r>
-      <w:r>
-        <w:t xml:space="preserve"> katı şekilde uygulanmıştır:</w:t>
-      </w:r>
-    </w:p>
-    <w:p>
-      <w:pPr>
-        <w:pStyle w:val="ListBullet"/>
-      </w:pPr>
-      <w:r>
-        <w:rPr>
-          <w:b/>
-        </w:rPr>
-        <w:t>Tuning Bütçesi:</w:t>
-      </w:r>
-      <w:r>
-        <w:t xml:space="preserve"> Her üç model için de aynı rastgele tohumdan (</w:t>
-      </w:r>
-      <w:r>
-        <w:rPr>
-          <w:rFonts w:ascii="Consolas" w:hAnsi="Consolas"/>
-          <w:sz w:val="19"/>
-        </w:rPr>
-        <w:t>seed=1234</w:t>
-      </w:r>
-      <w:r>
-        <w:t xml:space="preserve">) türetilen 6 hiperparametre adayı (learning rate, dropout, weight decay), deneme başına maksimum 10 epoch ve </w:t>
-      </w:r>
-      <w:r>
-        <w:rPr>
-          <w:i/>
-        </w:rPr>
-        <w:t>patience=5</w:t>
-      </w:r>
-      <w:r>
-        <w:t xml:space="preserve"> erken durdurma ile yalnızca Doğrulama (Val) kümesi üzerinde değerlendirilmiştir.</w:t>
-      </w:r>
-    </w:p>
-    <w:p>
-      <w:pPr>
-        <w:pStyle w:val="ListBullet"/>
-      </w:pPr>
-      <w:r>
-        <w:rPr>
-          <w:b/>
-        </w:rPr>
-        <w:t>Final Eğitim Bütçesi ve Hiperparametre Eşitliği:</w:t>
-      </w:r>
-      <w:r>
-        <w:t xml:space="preserve"> Seçilen en iyi hiperparametrelerle her model 5 bağımsız tohumda (</w:t>
-      </w:r>
-      <w:r>
-        <w:rPr>
-          <w:rFonts w:ascii="Consolas" w:hAnsi="Consolas"/>
-          <w:sz w:val="19"/>
-        </w:rPr>
-        <w:t>seed=0, 1, 2, 3, 4</w:t>
-      </w:r>
-      <w:r>
-        <w:t>) sıfırdan eğitilmiştir. Her üç model için:</w:t>
-      </w:r>
-    </w:p>
-    <w:p>
-      <w:pPr>
-        <w:pStyle w:val="ListBullet2"/>
-      </w:pPr>
-      <w:r>
-        <w:rPr>
-          <w:b/>
-        </w:rPr>
-        <w:t>Maksimum Epoch Sınırı:</w:t>
-      </w:r>
-      <w:r>
-        <w:t xml:space="preserve"> 25 epoch (tüm modeller için sabit üst sınır).</w:t>
-      </w:r>
-    </w:p>
-    <w:p>
-      <w:pPr>
-        <w:pStyle w:val="ListBullet2"/>
-      </w:pPr>
-      <w:r>
-        <w:rPr>
-          <w:b/>
-        </w:rPr>
-        <w:t>Mini-batch Boyutu (Batch Size):</w:t>
-      </w:r>
-      <w:r>
-        <w:t xml:space="preserve"> 64 (tüm modeller ve tohumlar için sabit).</w:t>
-      </w:r>
-    </w:p>
-    <w:p>
-      <w:pPr>
-        <w:pStyle w:val="ListBullet2"/>
-      </w:pPr>
-      <w:r>
-        <w:rPr>
-          <w:b/>
-        </w:rPr>
-        <w:t>Optimizatör ve Kayıp Fonksiyonu:</w:t>
-      </w:r>
-      <w:r>
-        <w:t xml:space="preserve"> AdamW optimizatörü, Huber Loss (</w:t>
-      </w:r>
-      <w:r>
-        <w:rPr>
-          <w:i/>
-        </w:rPr>
-        <w:t>delta=1.0</w:t>
-      </w:r>
-      <w:r>
-        <w:t xml:space="preserve">), gradyan kırpma (gradient clipping, </w:t>
-      </w:r>
-      <w:r>
-        <w:rPr>
-          <w:rFonts w:ascii="Consolas" w:hAnsi="Consolas"/>
-          <w:sz w:val="19"/>
-        </w:rPr>
-        <w:t>max_norm=1.0</w:t>
-      </w:r>
-      <w:r>
-        <w:t>), öğrenme oranı zamanlayıcısı (</w:t>
-      </w:r>
-      <w:r>
-        <w:rPr>
-          <w:rFonts w:ascii="Consolas" w:hAnsi="Consolas"/>
-          <w:sz w:val="19"/>
-        </w:rPr>
-        <w:t>ReduceLROnPlateau</w:t>
-      </w:r>
-      <w:r>
-        <w:t>, factor=0.5, patience=2).</w:t>
-      </w:r>
-    </w:p>
-    <w:p>
-      <w:pPr>
-        <w:pStyle w:val="ListBullet2"/>
-      </w:pPr>
-      <w:r>
-        <w:rPr>
-          <w:b/>
-        </w:rPr>
-        <w:t>Erken Durdurma (Early Stopping):</w:t>
-      </w:r>
-      <w:r>
-        <w:t xml:space="preserve"> </w:t>
-      </w:r>
-      <w:r>
-        <w:rPr>
-          <w:i/>
-        </w:rPr>
-        <w:t>patience = 5</w:t>
-      </w:r>
-      <w:r>
-        <w:t xml:space="preserve"> epoch (Doğrulama MAE değeri ardışık 5 epoch boyunca </w:t>
-      </w:r>
-      <w:r>
-        <w:rPr>
-          <w:i/>
-        </w:rPr>
-        <w:t>≥ 10^-5</w:t>
-      </w:r>
-      <w:r>
-        <w:t xml:space="preserve"> iyileşme göstermediğinde eğitim otomatik kesilir ve hafızadaki en iyi doğrulama kontrol noktası [checkpoint] geri yüklenir).</w:t>
-      </w:r>
-    </w:p>
-    <w:p>
-      <w:pPr>
-        <w:pStyle w:val="ListBullet"/>
-      </w:pPr>
-      <w:r>
-        <w:rPr>
-          <w:b/>
-        </w:rPr>
-        <w:t>Ortalama Epoch Farkının Sebebi (8.4 / 9.2 / 10.2):</w:t>
-      </w:r>
-      <w:r>
-        <w:t xml:space="preserve"> Tablodaki ortalama epoch sayılarının küçük farklılıklar göstermesi (CNN: 8.4, LSTM: 9.2, Transformer: 10.2), modellere farklı eğitim süresi verilmesinden </w:t>
-      </w:r>
-      <w:r>
-        <w:rPr>
-          <w:b/>
-        </w:rPr>
-        <w:t>değildir</w:t>
-      </w:r>
-      <w:r>
-        <w:t>. Tüm modellere eşit 25 epoch verilmiş, ancak erken durdurma mekanizması modellerin yakınsama ve aşırı öğrenme hızlarına göre eğitimi farklı noktalarda (CNN: 6–14 epoch, LSTM: 6–14 epoch, Transformer: 8–12 epoch) sonlandırmıştır.</w:t>
-      </w:r>
-    </w:p>
-    <w:p>
-      <w:pPr>
-        <w:pStyle w:val="ListBullet"/>
-      </w:pPr>
-      <w:r>
-        <w:rPr>
-          <w:b/>
-        </w:rPr>
         <w:t>Kilitli Test Seti İzolasyonu:</w:t>
       </w:r>
       <w:r>
-        <w:t xml:space="preserve"> Test kümesi hiperparametre seçiminde, epoch belirlemede veya erken durdurmada </w:t>
-      </w:r>
-      <w:r>
-        <w:rPr>
-          <w:b/>
-        </w:rPr>
-        <w:t>asla kullanılmamış</w:t>
-      </w:r>
-      <w:r>
-        <w:t>; sadece en iyi ağırlıklar yüklendikten sonra her tohum için yalnızca bir kez nihai metrik ölçümü yapılmıştır.</w:t>
+        <w:t xml:space="preserve"> Test kümesi hiperparametre seçiminde veya eğitim sırasında hiçbir aşamada kullanılmamış; yalnızca en iyi ağırlıklar yüklendikten sonra her tohum için bir kez nihai değerlendirme amacıyla çalıştırılmıştır.</w:t>
       </w:r>
     </w:p>
     <w:p>
@@ -4287,7 +4305,7 @@
     </w:p>
     <w:p>
       <w:r>
-        <w:t>Tekil sensör okuması senaryosunda (50 ısınma + 1000 iterasyon x 3 bağımsız blok):</w:t>
+        <w:t>Tekil sensör okuması senaryosunda (50 ısınma + 10⁰0 iterasyon x 3 bağımsız blok):</w:t>
       </w:r>
     </w:p>
     <w:tbl>
@@ -4674,7 +4692,7 @@
     </w:p>
     <w:p>
       <w:r>
-        <w:t xml:space="preserve">Ana deneyde olduğu gibi, transfer öğrenme aşaması da rastgeleliği kontrol altına almak için </w:t>
+        <w:t xml:space="preserve">Ana deneyde olduğu gibi transfer öğrenme aşaması da rastgeleliği kontrol altına almak için </w:t>
       </w:r>
       <w:r>
         <w:rPr>
@@ -4761,17 +4779,7 @@
         <w:t>df=4, t_crit=2.776</w:t>
       </w:r>
       <w:r>
-        <w:t xml:space="preserve">) ile hesaplanmıştır; tabloda her satır için </w:t>
-      </w:r>
-      <w:r>
-        <w:rPr>
-          <w:rFonts w:ascii="Consolas" w:hAnsi="Consolas"/>
-          <w:sz w:val="19"/>
-        </w:rPr>
-        <w:t>#seed = 5</w:t>
-      </w:r>
-      <w:r>
-        <w:t xml:space="preserve"> olarak belirtilmiştir.</w:t>
+        <w:t>) ile hesaplanmıştır.</w:t>
       </w:r>
     </w:p>
     <w:p>
@@ -8078,12 +8086,12 @@
         <w:pStyle w:val="Heading3"/>
       </w:pPr>
       <w:r>
-        <w:t>7.1 Ampirik Bulguların Özeti</w:t>
+        <w:t>7.1 Bulguların Tartışılması ve İstatistiksel Çıkarımlar</w:t>
       </w:r>
     </w:p>
     <w:p>
       <w:r>
-        <w:t>Aşağıdaki sonuçlar doğrudan bu çalışmadaki ampirik ölçümlerden (5 seed ortalaması, %95 güven aralıkları ve kilitli test dönemi) çıkarılmıştır:</w:t>
+        <w:t>Kilitli test kümesi üzerinde 5 bağımsız rastgele tohumla elde edilen ölçümler ve hipotez testleri şu sonuçları ortaya koymaktadır:</w:t>
       </w:r>
     </w:p>
     <w:p>
@@ -8147,16 +8155,7 @@
         <w:t>CNN &gt; LSTM</w:t>
       </w:r>
       <w:r>
-        <w:t xml:space="preserve"> üstünlüğü </w:t>
-      </w:r>
-      <w:r>
-        <w:rPr>
-          <w:b/>
-        </w:rPr>
-        <w:t>desteklenmemiştir</w:t>
-      </w:r>
-      <w:r>
-        <w:t>.</w:t>
+        <w:t xml:space="preserve"> üstünlüğü desteklenmemiştir.</w:t>
       </w:r>
     </w:p>
     <w:p>
@@ -8202,7 +8201,7 @@
         <w:t>p &lt; 0.0001</w:t>
       </w:r>
       <w:r>
-        <w:t>) istatistiksel olarak belirgin düzeyde daha kötü performans göstermiştir. İlginç şekilde, doğrulama (val) aşamasında en düşük hatayı (</w:t>
+        <w:t>) istatistiksel olarak belirgin düzeyde daha kötü performans göstermiştir. Doğrulama (val) aşamasında en düşük hatayı (</w:t>
       </w:r>
       <w:r>
         <w:rPr>
@@ -8211,7 +8210,7 @@
         <w:t>0.0824</w:t>
       </w:r>
       <w:r>
-        <w:t>) elde eden Transformer, test dönemine genelleşememiş ve aşırı öğrenme sergilemiştir. Ayrıca doğrulama dönemi (Ekim–Şubat / Sonbahar-Kış) ile test dönemi (Şubat–Mayıs / İlkbahar) farklı fenolojik mevsimlere denk geldiği için, zayıf endüktif yanlılığa sahip Transformer mevsimsel dağılım kaymasına (seasonal distribution shift) karşı en hassas model olmuştur.</w:t>
+        <w:t>) elde eden Transformer, test dönemine genelleşememiş ve aşırı öğrenme sergilemiştir. Doğrulama dönemi (Ekim–Şubat / Sonbahar-Kış) ile test dönemi (Şubat–Mayıs / İlkbahar) farklı fenolojik mevsimlere denk geldiğinden, zayıf endüktif yanlılığa sahip Transformer mevsimsel dağılım kaymasına (seasonal distribution shift) karşı en hassas model olmuştur.</w:t>
       </w:r>
     </w:p>
     <w:p>
@@ -8222,7 +8221,7 @@
         <w:rPr>
           <w:b/>
         </w:rPr>
-        <w:t>Uzun Bağlam Penceresi Nektar Akışında Fayda Sağlamamıştır:</w:t>
+        <w:t>Uzun Bağlam Penceresi Nektar Akışında Katkı Sağlamamıştır:</w:t>
       </w:r>
       <w:r>
         <w:t xml:space="preserve">  </w:t>
@@ -8559,20 +8558,20 @@
               <w:rPr>
                 <w:sz w:val="18"/>
               </w:rPr>
-              <w:t>Test MAE: CNN 0.233, LSTM 0.229, Transformer 0.327 kg/24s. CNN–LSTM farkı anlamsız (</w:t>
+              <w:t>Test MAE: CNN 0.233, LSTM 0.229, Transformer 0.327 kg/24s. CNN–LSTM farkı istatistiksel olarak anlamsızdır (</w:t>
             </w:r>
             <w:r>
               <w:rPr>
                 <w:i/>
                 <w:sz w:val="18"/>
               </w:rPr>
-              <w:t>p = 0.73</w:t>
-            </w:r>
-            <w:r>
-              <w:rPr>
-                <w:sz w:val="18"/>
-              </w:rPr>
-              <w:t>); en dar güven aralığı CNN'de (</w:t>
+              <w:t>p = 0.7257</w:t>
+            </w:r>
+            <w:r>
+              <w:rPr>
+                <w:sz w:val="18"/>
+              </w:rPr>
+              <w:t>); en dar güven aralığı CNN'dedir (</w:t>
             </w:r>
             <w:r>
               <w:rPr>
@@ -8610,7 +8609,7 @@
               <w:rPr>
                 <w:sz w:val="18"/>
               </w:rPr>
-              <w:t xml:space="preserve"> (Transformer en zayıf; CNN &gt; LSTM üstünlüğü yok)</w:t>
+              <w:t xml:space="preserve"> (Transformer en zayıf; CNN &gt; LSTM üstünlüğü gözlenmedi)</w:t>
             </w:r>
           </w:p>
         </w:tc>
@@ -8637,7 +8636,7 @@
               <w:rPr>
                 <w:sz w:val="18"/>
               </w:rPr>
-              <w:t xml:space="preserve"> Transformer bağlam arttıkça (</w:t>
+              <w:t xml:space="preserve"> Transformer bağlam genişledikçe (</w:t>
             </w:r>
             <w:r>
               <w:rPr>
@@ -8650,7 +8649,7 @@
               <w:rPr>
                 <w:sz w:val="18"/>
               </w:rPr>
-              <w:t>) LSTM'e göre daha belirgin kazanır; LSTM 168 adımda doyuma ulaşır.</w:t>
+              <w:t>) LSTM'e kıyasla daha belirgin kazanım sağlar; LSTM 168 adımda doyuma ulaşır.</w:t>
             </w:r>
           </w:p>
         </w:tc>
@@ -8668,20 +8667,33 @@
               <w:rPr>
                 <w:sz w:val="18"/>
               </w:rPr>
-              <w:t xml:space="preserve">Transformer 24 saatte 0.239 iken 168 saatte 0.327'ye fırlayarak şiddetli bozuldu. LSTM </w:t>
+              <w:t>Transformer'ın test hatası bağlam uzadıkça belirgin biçimde artmıştır (</w:t>
             </w:r>
             <w:r>
               <w:rPr>
                 <w:i/>
                 <w:sz w:val="18"/>
               </w:rPr>
-              <w:t>0.231 → 0.229</w:t>
-            </w:r>
-            <w:r>
-              <w:rPr>
-                <w:sz w:val="18"/>
-              </w:rPr>
-              <w:t xml:space="preserve"> (güven aralıkları çakışıyor, anlamlı değişim yok).</w:t>
+              <w:t>0.2390 → 0.3268</w:t>
+            </w:r>
+            <w:r>
+              <w:rPr>
+                <w:sz w:val="18"/>
+              </w:rPr>
+              <w:t>); LSTM ise bağlam değişiminden etkilenmemiştir (</w:t>
+            </w:r>
+            <w:r>
+              <w:rPr>
+                <w:i/>
+                <w:sz w:val="18"/>
+              </w:rPr>
+              <w:t>0.2312 → 0.2292</w:t>
+            </w:r>
+            <w:r>
+              <w:rPr>
+                <w:sz w:val="18"/>
+              </w:rPr>
+              <w:t>).</w:t>
             </w:r>
           </w:p>
         </w:tc>
@@ -8700,13 +8712,13 @@
                 <w:b/>
                 <w:sz w:val="18"/>
               </w:rPr>
-              <w:t>Reddedildi</w:t>
-            </w:r>
-            <w:r>
-              <w:rPr>
-                <w:sz w:val="18"/>
-              </w:rPr>
-              <w:t xml:space="preserve"> (Transformer uzun bağlamda ezildi; LSTM bağlamdan etkilenmedi)</w:t>
+              <w:t>Desteklenmedi</w:t>
+            </w:r>
+            <w:r>
+              <w:rPr>
+                <w:sz w:val="18"/>
+              </w:rPr>
+              <w:t xml:space="preserve"> (Transformer uzun bağlamda genelleşemedi; LSTM bağlam genişliğine dayanıklılık gösterdi)</w:t>
             </w:r>
           </w:p>
         </w:tc>
@@ -8751,7 +8763,7 @@
               <w:rPr>
                 <w:sz w:val="18"/>
               </w:rPr>
-              <w:t>Median gecikme: LSTM 0.58 ms, CNN 1.10 ms, Transformer 2.04 ms.</w:t>
+              <w:t>Medyan gecikme: LSTM 0.58 ms, CNN 1.10 ms, Transformer 2.04 ms.</w:t>
             </w:r>
           </w:p>
         </w:tc>
@@ -8776,7 +8788,7 @@
               <w:rPr>
                 <w:sz w:val="18"/>
               </w:rPr>
-              <w:t xml:space="preserve"> (Transformer en yavaş; ancak LSTM konvolüsyondan daha hızlı)</w:t>
+              <w:t xml:space="preserve"> (Transformer en yavaş model; ancak tekil örnek çıkarımında LSTM konvolüsyondan daha düşük gecikme sundu)</w:t>
             </w:r>
           </w:p>
         </w:tc>
@@ -8788,7 +8800,7 @@
         <w:pStyle w:val="Heading3"/>
       </w:pPr>
       <w:r>
-        <w:t>7.3 Sentez: "Hangi Koşulda Hangi Mimari, Neden?"</w:t>
+        <w:t>7.3 Sentez ve Mimari Tercih Kriterleri</w:t>
       </w:r>
     </w:p>
     <w:p>
@@ -8799,7 +8811,7 @@
         <w:rPr>
           <w:b/>
         </w:rPr>
-        <w:t>Kovan Telemetri Tahmininde Mimari Seçim Kararı:</w:t>
+        <w:t>Kovan Telemetri Tahmininde Mimari Tercih Rehberi:</w:t>
       </w:r>
     </w:p>
     <w:p>
@@ -8807,13 +8819,13 @@
         <w:pStyle w:val="Quote"/>
       </w:pPr>
       <w:r>
-        <w:t xml:space="preserve">Kovan sensör verilerinin orta ölçekli veri hacmi (~48k–50k parametre rejimi, tek kovan kaynağı) ve güçlü 24 saatlik sirkadiyen periyodu altında, </w:t>
+        <w:t xml:space="preserve">Kovan sensör verilerinin orta ölçekli veri hacmi (~48k–50k parametre rejimi, tek kovan kaynağı) ve belirgin 24 saatlik sirkadiyen periyodu altında, </w:t>
       </w:r>
       <w:r>
         <w:rPr>
           <w:b/>
         </w:rPr>
-        <w:t>Causal CNN ve LSTM istatistiksel olarak eşdeğer doğruluk sağlamaktadır; dolayısıyla seçim doğruluğa değil donanım ve dağıtım kısıtlarına göre yapılmalıdır.</w:t>
+        <w:t>Causal CNN ve LSTM istatistiksel olarak eşdeğer doğruluk sağlamaktadır; dolayısıyla seçim kriteri doğruluğa değil donanım ve dağıtım kısıtlarına göre şekillenmelidir.</w:t>
       </w:r>
       <w:r>
         <w:t xml:space="preserve"> Düşük bellekli mikrodenetleyicilerde (MCU) ve gerçek zamanlı sensör akışında (streaming edge computing) </w:t>
@@ -8948,19 +8960,10 @@
         <w:rPr>
           <w:b/>
         </w:rPr>
-        <w:t>Doğrulama Notu:</w:t>
-      </w:r>
-      <w:r>
-        <w:t xml:space="preserve"> Bu rapordaki tüm parametre ve MAC sayıları </w:t>
-      </w:r>
-      <w:r>
-        <w:rPr>
-          <w:b/>
-        </w:rPr>
-        <w:t>önce analitik matematiksel formüllerle elle türetilmiş</w:t>
-      </w:r>
-      <w:r>
-        <w:t>, ardından PyTorch tensör kancaları (</w:t>
+        <w:t>Metodolojik Not:</w:t>
+      </w:r>
+      <w:r>
+        <w:t xml:space="preserve"> Bu raporda yer alan tüm mimarilere ait serbest parametre ve MAC (Multiply-Accumulate) sayıları, katman bazında analitik matematiksel bağıntılarla formüle edilmiş; ardından PyTorch tensör kancaları (</w:t>
       </w:r>
       <w:r>
         <w:rPr>
@@ -8970,7 +8973,7 @@
         <w:t>forward hook</w:t>
       </w:r>
       <w:r>
-        <w:t>) ve tensör boyutları üzerinden çalışan test betiğiyle (</w:t>
+        <w:t>) aracılığıyla doğrulanmıştır (</w:t>
       </w:r>
       <w:r>
         <w:rPr>
@@ -8980,16 +8983,7 @@
         <w:t>python src/models.py</w:t>
       </w:r>
       <w:r>
-        <w:t xml:space="preserve">) </w:t>
-      </w:r>
-      <w:r>
-        <w:rPr>
-          <w:b/>
-        </w:rPr>
-        <w:t>birebir doğrulanmıştır</w:t>
-      </w:r>
-      <w:r>
-        <w:t>. Kod çıktısı analitik hesaplamalarla %100 tam eşleşmektedir.</w:t>
+        <w:t>). Analitik formülasyon ile tensör seviyesindeki operasyon sayıları tam örtüşmektedir.</w:t>
       </w:r>
     </w:p>
     <w:p>
@@ -9201,15 +9195,15 @@
           <w:rFonts w:ascii="Cambria Math" w:hAnsi="Cambria Math"/>
           <w:i/>
         </w:rPr>
-        <w:t>RF = 1 + 4 · 63 = 253 ≥ 168 quad (✓)</w:t>
+        <w:t>RF = 1 + 4 · 63 = 253 ≥ 168</w:t>
       </w:r>
     </w:p>
     <w:p>
       <w:r>
         <w:rPr>
-          <w:i/>
+          <w:b/>
         </w:rPr>
-        <w:t>Kritik İnceleme:</w:t>
+        <w:t>Katman Sayısı Seçiminin Gerekçesi:</w:t>
       </w:r>
       <w:r>
         <w:t xml:space="preserve"> Eğer 5 blok seçilseydi (</w:t>
@@ -9245,9 +9239,9 @@
     <w:p>
       <w:r>
         <w:rPr>
-          <w:i/>
+          <w:b/>
         </w:rPr>
-        <w:t>Ampirik Doğrulama:</w:t>
+        <w:t>Ampirik RF Doğrulaması:</w:t>
       </w:r>
       <w:r>
         <w:t xml:space="preserve"> Son çıktı adımının girdiye göre gradyanı (</w:t>
@@ -9259,16 +9253,7 @@
         <w:t>∂ ŷ / ∂ x_t</w:t>
       </w:r>
       <w:r>
-        <w:t xml:space="preserve">) geriye doğru taranmış; gradyanın sıfırdan farklı olduğu en eski zaman adımı </w:t>
-      </w:r>
-      <w:r>
-        <w:rPr>
-          <w:b/>
-        </w:rPr>
-        <w:t>tam 253 adım</w:t>
-      </w:r>
-      <w:r>
-        <w:t xml:space="preserve"> olarak ölçülmüştür.</w:t>
+        <w:t>) geriye doğru taranmış; gradyanın sıfırdan farklı olduğu en eski zaman adımı tam 253 adım olarak kaydedilmiştir.</w:t>
       </w:r>
     </w:p>
     <w:p>
@@ -10309,11 +10294,7 @@
         <w:jc w:val="center"/>
       </w:pPr>
       <w:r>
-        <w:rPr>
-          <w:rFonts w:ascii="Cambria Math" w:hAnsi="Cambria Math"/>
-          <w:i/>
-        </w:rPr>
-        <w:t>Maksimum Model Parametre Sapması = (49,829 - 48,305)/(48,305) × 100 = 3.1% ≤ 5% quad (İzo-parametre koşulu sağlandı)</w:t>
+        <w:t>Maksimum Model Parametre Sapması = (49,829 - 48,305)/(48,305) × 10⁰ = 3.1% ≤ 5%</w:t>
       </w:r>
     </w:p>
     <w:p>
@@ -11113,7 +11094,7 @@
         <w:t>T × T</w:t>
       </w:r>
       <w:r>
-        <w:t xml:space="preserve"> yoğun matris çarpımı yapıp ardından maskelediği için donanım seviyesinde yoğun (dense) MAC gerçekleşir. LSTM işlem yükünde CNN ile başa baş iken, zaman adımları sıralı ilerlediği için paralelleşemez; fakat tekil batch (</w:t>
+        <w:t xml:space="preserve"> matris çarpımı yapıp ardından maskelediği için donanım seviyesinde yoğun (dense) MAC gerçekleşir. LSTM işlem yükünde CNN ile başa baş iken, zaman adımları sıralı ilerlediği için paralelleşemez; fakat tekil batch (</w:t>
       </w:r>
       <w:r>
         <w:rPr>
@@ -11122,7 +11103,7 @@
         <w:t>B=1</w:t>
       </w:r>
       <w:r>
-        <w:t>) çıkarımında en düşük işlem hafızasıyla en hızlı model olmuştur.</w:t>
+        <w:t>) çıkarımında en düşük bellek ayak iziyle en hızlı model olmuştur.</w:t>
       </w:r>
     </w:p>
     <w:p>
@@ -11198,7 +11179,7 @@
         <w:t>Problem:</w:t>
       </w:r>
       <w:r>
-        <w:t xml:space="preserve"> Kovan telemetri sensörleri (</w:t>
+        <w:t xml:space="preserve"> Kovan içi telemetri sensörleri (</w:t>
       </w:r>
       <w:r>
         <w:rPr>
@@ -11216,7 +11197,7 @@
         <w:t>T_out, H_out, P_out, V_wind</w:t>
       </w:r>
       <w:r>
-        <w:t>) kullanılarak sonraki 24 saatteki kovan ağırlığı değişiminin (</w:t>
+        <w:t>) kullanılarak sonraki 24 saatteki net kovan ağırlığı değişiminin (</w:t>
       </w:r>
       <w:r>
         <w:rPr>
@@ -11249,7 +11230,7 @@
     </w:p>
     <w:p>
       <w:r>
-        <w:t>Makine öğreniminde bir modelin genelleştirme kabiliyeti, hipotez uzayının (</w:t>
+        <w:t>Makine öğreniminde bir modelin sınırlı veri altında sergileyeceği genelleştirme kabiliyeti, hipotez uzayının (</w:t>
       </w:r>
       <w:r>
         <w:rPr>
@@ -11258,7 +11239,7 @@
         <w:t>mathcalH</w:t>
       </w:r>
       <w:r>
-        <w:t>) problemin fiziksel ve biyolojik veri üretim sürecine uyumlu öncül varsayımlarla (endüktif yanlılık) ne ölçüde kısıtlandığına bağlıdır:</w:t>
+        <w:t>) problemin fiziksel ve biyolojik veri üretim sürecine uyumlu yapısal öncül varsayımlarla ne ölçüde sınırlandırıldığına bağlıdır:</w:t>
       </w:r>
     </w:p>
     <w:p>
@@ -11274,43 +11255,48 @@
       </w:r>
     </w:p>
     <w:p>
+      <w:r>
+        <w:t xml:space="preserve">Burada düzenlileştirici terim </w:t>
+      </w:r>
+      <w:r>
+        <w:rPr>
+          <w:i/>
+        </w:rPr>
+        <w:t>Omega(f)</w:t>
+      </w:r>
+      <w:r>
+        <w:t>, doğrudan mimarinin endüktif yanlılığı (inductive bias) tarafından belirlenir. Kovan sensör telemetrisi ve meteorolojik zaman serileri, bal arılarının sirkadiyen biyolojisi ve yerel mikro-iklim koşullarıyla şekillenen periyodik dinamikler içerdiğinden, karşılaştırılan üç temel mimarinin kuramsal uygunluğu eğitim öncesinde şu şekilde modellenmiştir:</w:t>
+      </w:r>
+    </w:p>
+    <w:p>
       <w:pPr>
         <w:pStyle w:val="Heading4"/>
       </w:pPr>
       <w:r>
-        <w:t>A. Causal Dilated Residual CNN (TCN)</w:t>
+        <w:t>1.1 Causal Dilated Residual CNN (TCN)</w:t>
       </w:r>
     </w:p>
     <w:p>
-      <w:pPr>
-        <w:pStyle w:val="ListBullet"/>
-      </w:pPr>
+      <w:r>
+        <w:t xml:space="preserve">Causal Dilated CNN mimarisinin temel yapısal yanlılığı, zaman ekseni üzerindeki katı </w:t>
+      </w:r>
       <w:r>
         <w:rPr>
           <w:b/>
         </w:rPr>
-        <w:t>Temel Endüktif Yanlılık:</w:t>
-      </w:r>
-      <w:r>
-        <w:t xml:space="preserve"> </w:t>
+        <w:t>yerellik (locality)</w:t>
+      </w:r>
+      <w:r>
+        <w:t xml:space="preserve"> ve </w:t>
       </w:r>
       <w:r>
         <w:rPr>
           <w:b/>
         </w:rPr>
-        <w:t>Yerellik (Locality)</w:t>
-      </w:r>
-      <w:r>
-        <w:t xml:space="preserve"> ve </w:t>
-      </w:r>
-      <w:r>
-        <w:rPr>
-          <w:b/>
-        </w:rPr>
-        <w:t>Zamansal Öteleme Eşdeğerliği (Temporal Translation Equivariance)</w:t>
-      </w:r>
-      <w:r>
-        <w:t>:</w:t>
+        <w:t>zamansal öteleme eşdeğerliği (temporal translation equivariance)</w:t>
+      </w:r>
+      <w:r>
+        <w:t xml:space="preserve"> varsayımlarına dayanır:</w:t>
       </w:r>
     </w:p>
     <w:p>
@@ -11326,20 +11312,6 @@
       </w:r>
     </w:p>
     <w:p>
-      <w:pPr>
-        <w:pStyle w:val="ListBullet"/>
-      </w:pPr>
-      <w:r>
-        <w:rPr>
-          <w:b/>
-        </w:rPr>
-        <w:t>Biyolojik Kovan Dinamiklerine Uyumu:</w:t>
-      </w:r>
-      <w:r>
-        <w:t xml:space="preserve">  </w:t>
-      </w:r>
-    </w:p>
-    <w:p>
       <w:r>
         <w:t>Bal arılarının (</w:t>
       </w:r>
@@ -11350,35 +11322,21 @@
         <w:t>Apis mellifera</w:t>
       </w:r>
       <w:r>
-        <w:t>) nektar toplama uçuşları, kovan içi havalandırma faaliyetleri ve metabolik tüketimi, doğrudan 24 saatlik güneş döngüsüne (sirkadiyen ritim) ve yerel sıcaklık değişimlerine bağlıdır. Konvolüsyonel çekirdekler zaman ekseni boyunca ağırlık paylaştığı için (weight sharing), günün belirli saatlerinde ortaya çıkan tipik mikro-örüntüleri (örn. sabah uçuş başlangıcındaki ani ağırlık kaybı veya akşam nektar depolaması) zamansal konumdan bağımsız olarak çok az serbest parametreyle öğrenebilir.</w:t>
+        <w:t>) nektar ve polen toplama uçuşları, kovan içi havalandırma faaliyetleri ve metabolik tüketimi doğrudan 24 saatlik sirkadiyen güneş döngüsüne ve yerel sıcaklık eğrilerine bağlıdır. Konvolüsyonel filtreler zaman ekseni boyunca ağırlık paylaştığından (weight sharing), günün belirli saatlerinde tekrarlayan mikro-örüntüleri (örneğin sabah uçuş başlangıcındaki ani kütle kaybı veya akşam saatlerindeki nektar depolaması) zamansal konumdan bağımsız olarak az sayıda serbest parametreyle öğrenebilir.</w:t>
       </w:r>
     </w:p>
     <w:p>
-      <w:pPr>
-        <w:pStyle w:val="ListBullet"/>
-      </w:pPr>
-      <w:r>
-        <w:rPr>
-          <w:b/>
-        </w:rPr>
-        <w:t>Genişletilmiş Geçmiş (Dilation):</w:t>
-      </w:r>
-      <w:r>
-        <w:t xml:space="preserve">  </w:t>
-      </w:r>
-    </w:p>
-    <w:p>
-      <w:r>
-        <w:t>Üstel artan dilation faktörleri (</w:t>
+      <w:r>
+        <w:t>Ayrıca üstel olarak genişleyen dilation hiyerarşisi (</w:t>
       </w:r>
       <w:r>
         <w:rPr>
           <w:i/>
         </w:rPr>
-        <w:t>d ∈ 1, 2, 4, 8, 16, 32</w:t>
-      </w:r>
-      <w:r>
-        <w:t xml:space="preserve">) sayesinde, 168 saatlik haftalık hava örüntüleri herhangi bir bilgi sıkıştırma darboğazına (compression bottleneck) uğramadan hiyerarşik olarak </w:t>
+        <w:t>d_i ∈ 1, 2, 4, 8, 16, 32</w:t>
+      </w:r>
+      <w:r>
+        <w:t xml:space="preserve">), modelin 168 saatlik haftalık hava dalgalarını herhangi bir bilgi sıkıştırma darboğazına (compression bottleneck) uğramadan doğrudan </w:t>
       </w:r>
       <w:r>
         <w:rPr>
@@ -11387,35 +11345,7 @@
         <w:t>RF=253</w:t>
       </w:r>
       <w:r>
-        <w:t xml:space="preserve"> adımlık bir kapsama alanında işlenir.</w:t>
-      </w:r>
-    </w:p>
-    <w:p>
-      <w:pPr>
-        <w:pStyle w:val="ListBullet"/>
-      </w:pPr>
-      <w:r>
-        <w:rPr>
-          <w:b/>
-        </w:rPr>
-        <w:t>Ampirik Beklenti:</w:t>
-      </w:r>
-      <w:r>
-        <w:t xml:space="preserve">  </w:t>
-      </w:r>
-    </w:p>
-    <w:p>
-      <w:r>
-        <w:t xml:space="preserve">Kısıtlı etiketli veri hacminde (~10.000 saatlik eğitim örneği) güçlü yapısal kısıtları sayesinde </w:t>
-      </w:r>
-      <w:r>
-        <w:rPr>
-          <w:b/>
-        </w:rPr>
-        <w:t>aşırı öğrenmeye (overfitting) en dirençli</w:t>
-      </w:r>
-      <w:r>
-        <w:t xml:space="preserve"> ve en düşük genelleştirme varyansına sahip mimari olması beklenmektedir.</w:t>
+        <w:t xml:space="preserve"> adımlık bir kapsama alanında işlemesini sağlar. Kısıtlı etiketli veri hacminde (~10.000 saatlik eğitim örneği) bu güçlü yapısal kısıtlar, Causal CNN'in aşırı öğrenmeye (overfitting) en dirençli ve en düşük genelleştirme varyansına sahip mimari olacağını düşündürmektedir.</w:t>
       </w:r>
     </w:p>
     <w:p>
@@ -11423,39 +11353,30 @@
         <w:pStyle w:val="Heading4"/>
       </w:pPr>
       <w:r>
-        <w:t>B. Long Short-Term Memory (LSTM)</w:t>
+        <w:t>1.2 Long Short-Term Memory (LSTM)</w:t>
       </w:r>
     </w:p>
     <w:p>
-      <w:pPr>
-        <w:pStyle w:val="ListBullet"/>
-      </w:pPr>
+      <w:r>
+        <w:t xml:space="preserve">LSTM mimarisi, katı bir </w:t>
+      </w:r>
       <w:r>
         <w:rPr>
           <w:b/>
         </w:rPr>
-        <w:t>Temel Endüktif Yanlılık:</w:t>
-      </w:r>
-      <w:r>
-        <w:t xml:space="preserve"> </w:t>
+        <w:t>ardışıklık (recurrence)</w:t>
+      </w:r>
+      <w:r>
+        <w:t xml:space="preserve"> ve </w:t>
       </w:r>
       <w:r>
         <w:rPr>
           <w:b/>
         </w:rPr>
-        <w:t>Ardışıklık (Strict Recurrence)</w:t>
-      </w:r>
-      <w:r>
-        <w:t xml:space="preserve"> ve </w:t>
-      </w:r>
-      <w:r>
-        <w:rPr>
-          <w:b/>
-        </w:rPr>
-        <w:t>Markovian Durum Güncellemesi</w:t>
-      </w:r>
-      <w:r>
-        <w:t>:</w:t>
+        <w:t>Markovian gizli durum sıkıştırması</w:t>
+      </w:r>
+      <w:r>
+        <w:t xml:space="preserve"> endüktif yanlılığı üzerine kuruludur:</w:t>
       </w:r>
     </w:p>
     <w:p>
@@ -11471,22 +11392,8 @@
       </w:r>
     </w:p>
     <w:p>
-      <w:pPr>
-        <w:pStyle w:val="ListBullet"/>
-      </w:pPr>
-      <w:r>
-        <w:rPr>
-          <w:b/>
-        </w:rPr>
-        <w:t>Biyolojik Kovan Dinamiklerine Uyumu:</w:t>
-      </w:r>
-      <w:r>
-        <w:t xml:space="preserve">  </w:t>
-      </w:r>
-    </w:p>
-    <w:p>
-      <w:r>
-        <w:t>Kovanın mevcut biyokütlesi, yavru alanı büyüklüğü ve bal stoku kümülatif birikimli bir durum değişkenidir (state variable). LSTM hücresinin gizli durumu (</w:t>
+      <w:r>
+        <w:t>Biyolojik açıdan bir arı kovanının anlık kütlesi, yavru alanı büyüklüğü ve bal stoğu kümülatif birikimli bir durum değişkenidir (state variable). LSTM hücresinin gizli durumu (</w:t>
       </w:r>
       <w:r>
         <w:rPr>
@@ -11504,26 +11411,12 @@
         <w:t>c_t ∈ mathbbR^H</w:t>
       </w:r>
       <w:r>
-        <w:t>), biyolojik koloninin içsel dinamik durumunu zamanda ileriye doğru taşımak için son derece doğal bir endüktif yanlılığa sahiptir.</w:t>
+        <w:t>), biyolojik koloninin içsel durumunu zamanda ileriye doğru taşımak için probleme son derece uyumlu bir fiziksel temsil sunar.</w:t>
       </w:r>
     </w:p>
     <w:p>
-      <w:pPr>
-        <w:pStyle w:val="ListBullet"/>
-      </w:pPr>
-      <w:r>
-        <w:rPr>
-          <w:b/>
-        </w:rPr>
-        <w:t>Teorik Kısıt:</w:t>
-      </w:r>
-      <w:r>
-        <w:t xml:space="preserve">  </w:t>
-      </w:r>
-    </w:p>
-    <w:p>
-      <w:r>
-        <w:t>Buna karşılık, 168 zaman adımı boyunca geriye yayılımda (BPTT), kapı gradyanlarının kümülatif çarpımı nedeniyle gradyan sönümlenmesi (vanishing gradient) kaçınılmazdır. Ayrıca sabit boyutlu (</w:t>
+      <w:r>
+        <w:t>Buna karşın, 168 zaman adımı boyunca geriye yayılımda (BPTT), kapı gradyanlarının kümülatif çarpımı nedeniyle gradyan sönümlenmesi (vanishing gradient) kaçınılmazdır. Ayrıca sabit boyutlu (</w:t>
       </w:r>
       <w:r>
         <w:rPr>
@@ -11532,26 +11425,7 @@
         <w:t>H=60</w:t>
       </w:r>
       <w:r>
-        <w:t>) tek bir vektörün 7 günlük meteorolojik fırtına/kuraklık geçmişini sıkıştırma zorunluluğu bilgi kaybına yol açabilir.</w:t>
-      </w:r>
-    </w:p>
-    <w:p>
-      <w:pPr>
-        <w:pStyle w:val="ListBullet"/>
-      </w:pPr>
-      <w:r>
-        <w:rPr>
-          <w:b/>
-        </w:rPr>
-        <w:t>Ampirik Beklenti:</w:t>
-      </w:r>
-      <w:r>
-        <w:t xml:space="preserve">  </w:t>
-      </w:r>
-    </w:p>
-    <w:p>
-      <w:r>
-        <w:t>Kısa bağlamlarda çok güçlü bir performans sergilemesi, ancak bağlam 168 saate uzadığında doyuma ulaşarak CNN'in bir miktar gerisinde kalması beklenmektedir.</w:t>
+        <w:t>) tek bir gizli vektörün 7 günlük çok değişkenli meteorolojik geçmişi ve sirkadiyen döngüleri sıkıştırma zorunluluğu bilgi kaybına yol açabilir. Bu kuramsal sınırlar nedeniyle, LSTM'in kısa bağlamlarda güçlü bir kestirim performansı sergileyeceği, ancak bağlam 168 saate uzadığında doyuma ulaşarak CNN'in bir miktar gerisinde kalacağı öngörülmektedir.</w:t>
       </w:r>
     </w:p>
     <w:p>
@@ -11559,30 +11433,30 @@
         <w:pStyle w:val="Heading4"/>
       </w:pPr>
       <w:r>
-        <w:t>C. Causal Masked Transformer</w:t>
+        <w:t>1.3 Causal Masked Transformer</w:t>
       </w:r>
     </w:p>
     <w:p>
-      <w:pPr>
-        <w:pStyle w:val="ListBullet"/>
-      </w:pPr>
+      <w:r>
+        <w:t xml:space="preserve">Transformer mimarisi, adımlar arasında doğuştan gelen hiçbir yerellik veya ardışıklık varsayımı içermez; </w:t>
+      </w:r>
       <w:r>
         <w:rPr>
           <w:b/>
         </w:rPr>
-        <w:t>Temel Endüktif Yanlılık:</w:t>
-      </w:r>
-      <w:r>
-        <w:t xml:space="preserve"> </w:t>
+        <w:t>global dinamik ikili dikkat (pairwise self-attention)</w:t>
+      </w:r>
+      <w:r>
+        <w:t xml:space="preserve"> ve </w:t>
       </w:r>
       <w:r>
         <w:rPr>
           <w:b/>
         </w:rPr>
-        <w:t>Global İlişkisellik ve Zayıf Yapısal Yanlılık (Weak Inductive Bias)</w:t>
-      </w:r>
-      <w:r>
-        <w:t>:</w:t>
+        <w:t>zayıf yapısal yanlılık (weak inductive bias)</w:t>
+      </w:r>
+      <w:r>
+        <w:t xml:space="preserve"> taşır:</w:t>
       </w:r>
     </w:p>
     <w:p>
@@ -11598,22 +11472,8 @@
       </w:r>
     </w:p>
     <w:p>
-      <w:pPr>
-        <w:pStyle w:val="ListBullet"/>
-      </w:pPr>
-      <w:r>
-        <w:rPr>
-          <w:b/>
-        </w:rPr>
-        <w:t>Biyolojik Kovan Dinamiklerine Uyumu:</w:t>
-      </w:r>
-      <w:r>
-        <w:t xml:space="preserve">  </w:t>
-      </w:r>
-    </w:p>
-    <w:p>
-      <w:r>
-        <w:t xml:space="preserve">Transformer mimarisi, adımlar arasında doğuştan gelen hiçbir yerellik veya ardışıklık varsaymaz. Dinamik dikkat matrisi sayesinde, örneğin 5 gün önceki şiddetli bir yağış ile bugünkü nektar açığı arasında doğrudan </w:t>
+      <w:r>
+        <w:t xml:space="preserve">Kuramsal açıdan dinamik dikkat mekanizması, adımlar arasındaki zamansal mesafeden bağımsız olarak </w:t>
       </w:r>
       <w:r>
         <w:rPr>
@@ -11622,26 +11482,12 @@
         <w:t>mathcalO(1)</w:t>
       </w:r>
       <w:r>
-        <w:t xml:space="preserve"> mesafeli bağ kurabilir.</w:t>
+        <w:t xml:space="preserve"> yol uzunluğuyla doğrudan ilişkisellik kurabilir. Örneğin 5 gün önceki şiddetli bir fırtına ile bugünkü nektar açığı arasında doğrudan bağlantı kurulabilmektedir.</w:t>
       </w:r>
     </w:p>
     <w:p>
-      <w:pPr>
-        <w:pStyle w:val="ListBullet"/>
-      </w:pPr>
-      <w:r>
-        <w:rPr>
-          <w:b/>
-        </w:rPr>
-        <w:t>Teorik Kısıt:</w:t>
-      </w:r>
-      <w:r>
-        <w:t xml:space="preserve">  </w:t>
-      </w:r>
-    </w:p>
-    <w:p>
-      <w:r>
-        <w:t>Zaman serilerinde konumsal sıra bilgisi mimarinin içine gömülü değildir; yalnızca sinüzoidal konumsal kodlama (</w:t>
+      <w:r>
+        <w:t>Ancak zaman serilerinde konumsal sıra bilgisi mimarinin içine gömülü olmayıp yalnızca sinüzoidal konumsal kodlama (</w:t>
       </w:r>
       <w:r>
         <w:rPr>
@@ -11650,26 +11496,7 @@
         <w:t>PE</w:t>
       </w:r>
       <w:r>
-        <w:t>) ile modele sonradan eklenir. Zayıf endüktif yanlılığa sahip modellerin düzenlilikleri sıfırdan öğrenebilmesi için devasa veri hacimleri gereklidir.</w:t>
-      </w:r>
-    </w:p>
-    <w:p>
-      <w:pPr>
-        <w:pStyle w:val="ListBullet"/>
-      </w:pPr>
-      <w:r>
-        <w:rPr>
-          <w:b/>
-        </w:rPr>
-        <w:t>Ampirik Beklenti:</w:t>
-      </w:r>
-      <w:r>
-        <w:t xml:space="preserve">  </w:t>
-      </w:r>
-    </w:p>
-    <w:p>
-      <w:r>
-        <w:t>Tek bir kovanın kısıtlı verisinde, serbest parametrelerin aşırı esnekliği nedeniyle eğitim kümesine kolayca aşırı uyum sağlayacağı (overfitting) ve test kümesinde en yüksek genelleştirme hatasını ve en geniş güven aralığını üreteceği öngörülmektedir.</w:t>
+        <w:t>) ile modele sonradan eklenmektedir. Zayıf endüktif yanlılığa sahip modellerin düzenlilikleri ve periyodik dinamikleri sıfırdan öğrenebilmesi için çok yüksek veri hacmi gerekmektedir. Tek bir kovanın sınırlı saatlik verisinde serbest parametrelerin aşırı esnekliği, modelin eğitim kümesine kolayca aşırı uyum sağlayacağını (overfitting) ve test kümesinde en yüksek genelleştirme hatasını ve en geniş güven aralığını üreteceğini düşündürmektedir.</w:t>
       </w:r>
     </w:p>
     <w:p>
@@ -11719,7 +11546,7 @@
         <w:t>Gerekçe:</w:t>
       </w:r>
       <w:r>
-        <w:t xml:space="preserve"> Yerellik ve öteleme eşdeğerliği, 24 saatlik sirkadiyen kovan döngüsünü modellemek için en güçlü koruyucu yanlılıktır.</w:t>
+        <w:t xml:space="preserve"> Yerellik ve zamansal öteleme eşdeğerliği, 24 saatlik sirkadiyen kovan döngüsünü modellemek için en güçlü koruyucu yanlılıktır.</w:t>
       </w:r>
     </w:p>
     <w:p>

</xml_diff>